<commit_message>
areb adversary-complaint, motion-brief: typst and docx on the shared cross-engine layout model; docx/make-reference.sh and the binary reference.docx give way to docx/reference.xml (base="xengine", Times New Roman from the typst face, was EB Garamond); docx XENG-001..003 pass (adversary complaint 42.3 % -> 100 % of lines, motion 100 %), params.cross_engine: gate; body paragraphs take the half-inch indent of the filed exemplars (fb-595.68.7)
</commit_message>
<xml_diff>
--- a/courts/eighth-circuit/arkansas/federal/bankruptcy-eastern-district/adversary-complaint/usage/OUTPUT-adversary-complaint.docx
+++ b/courts/eighth-circuit/arkansas/federal/bankruptcy-eastern-district/adversary-complaint/usage/OUTPUT-adversary-complaint.docx
@@ -4,45 +4,57 @@
   <w:body>
     <w:p>
       <w:pPr>
-        <w:pStyle w:val="CaptionHeading"/>
-      </w:pPr>
-      <w:r>
+        <w:spacing w:before="0" w:after="0" w:line="264" w:lineRule="exact"/>
+        <w:ind w:left="0" w:firstLine="0"/>
+        <w:jc w:val="center"/>
+      </w:pPr>
+      <w:r>
+        <w:rPr>
+          <w:b/>
+          <w:bCs/>
+        </w:rPr>
         <w:t xml:space="preserve">UNITED STATES BANKRUPTCY COURT</w:t>
       </w:r>
     </w:p>
     <w:p>
       <w:pPr>
-        <w:pStyle w:val="CaptionHeading"/>
-      </w:pPr>
-      <w:r>
+        <w:spacing w:before="0" w:after="0" w:line="264" w:lineRule="exact"/>
+        <w:ind w:left="0" w:firstLine="0"/>
+        <w:jc w:val="center"/>
+      </w:pPr>
+      <w:r>
+        <w:rPr>
+          <w:b/>
+          <w:bCs/>
+        </w:rPr>
         <w:t xml:space="preserve">EASTERN DISTRICT OF ARKANSAS</w:t>
       </w:r>
     </w:p>
     <w:p>
       <w:pPr>
-        <w:pStyle w:val="CaptionHeading"/>
-        <w:spacing w:before="0" w:after="384"/>
-      </w:pPr>
-      <w:r>
+        <w:spacing w:before="0" w:after="384" w:line="264" w:lineRule="exact"/>
+        <w:ind w:left="0" w:firstLine="0"/>
+        <w:jc w:val="center"/>
+      </w:pPr>
+      <w:r>
+        <w:rPr>
+          <w:b/>
+          <w:bCs/>
+        </w:rPr>
         <w:t xml:space="preserve">CENTRAL DIVISION</w:t>
       </w:r>
     </w:p>
     <w:tbl>
       <w:tblPr>
         <w:tblW w:w="9360" w:type="dxa"/>
-        <w:tblBorders>
-          <w:top w:val="nil"/>
-          <w:left w:val="nil"/>
-          <w:bottom w:val="nil"/>
-          <w:right w:val="nil"/>
-          <w:insideH w:val="nil"/>
-          <w:insideV w:val="nil"/>
-        </w:tblBorders>
         <w:tblLayout w:type="fixed"/>
         <w:tblCellMar>
+          <w:top w:w="0" w:type="dxa"/>
           <w:left w:w="0" w:type="dxa"/>
+          <w:bottom w:w="0" w:type="dxa"/>
           <w:right w:w="0" w:type="dxa"/>
         </w:tblCellMar>
+        <w:tblLook w:val="0000" w:firstRow="0" w:lastRow="0" w:firstColumn="0" w:lastColumn="0" w:noHBand="0" w:noVBand="0"/>
       </w:tblPr>
       <w:tblGrid>
         <w:gridCol w:w="5040"/>
@@ -64,7 +76,9 @@
           </w:tcPr>
           <w:p>
             <w:pPr>
-              <w:pStyle w:val="CaptionSingle"/>
+              <w:spacing w:before="0" w:after="0" w:line="264" w:lineRule="exact"/>
+              <w:ind w:left="0" w:firstLine="0"/>
+              <w:jc w:val="left"/>
             </w:pPr>
             <w:r>
               <w:t xml:space="preserve">IN RE:</w:t>
@@ -72,24 +86,53 @@
           </w:p>
           <w:p>
             <w:pPr>
-              <w:pStyle w:val="CaptionCentered"/>
+              <w:spacing w:before="0" w:after="0" w:line="264" w:lineRule="exact"/>
+              <w:ind w:left="0" w:firstLine="0"/>
+              <w:jc w:val="center"/>
             </w:pPr>
             <w:r>
-              <w:t xml:space="preserve">BRUCE WATKINS, II</w:t>
+              <w:t xml:space="preserve">BRUCE</w:t>
+            </w:r>
+            <w:r>
+              <w:t xml:space="preserve"> </w:t>
+            </w:r>
+            <w:r>
+              <w:t xml:space="preserve">WATKINS,</w:t>
+            </w:r>
+            <w:r>
+              <w:t xml:space="preserve"> </w:t>
+            </w:r>
+            <w:r>
+              <w:t xml:space="preserve">II</w:t>
             </w:r>
           </w:p>
           <w:p>
             <w:pPr>
-              <w:pStyle w:val="CaptionCentered"/>
+              <w:spacing w:before="0" w:after="0" w:line="264" w:lineRule="exact"/>
+              <w:ind w:left="0" w:firstLine="0"/>
+              <w:jc w:val="center"/>
             </w:pPr>
             <w:r>
-              <w:t xml:space="preserve">HEIDA FARQUE WATKINS</w:t>
+              <w:t xml:space="preserve">HEIDA</w:t>
+            </w:r>
+            <w:r>
+              <w:t xml:space="preserve"> </w:t>
+            </w:r>
+            <w:r>
+              <w:t xml:space="preserve">FARQUE</w:t>
+            </w:r>
+            <w:r>
+              <w:t xml:space="preserve"> </w:t>
+            </w:r>
+            <w:r>
+              <w:t xml:space="preserve">WATKINS</w:t>
             </w:r>
           </w:p>
           <w:p>
             <w:pPr>
-              <w:pStyle w:val="CaptionRight"/>
-              <w:spacing w:before="0" w:after="264"/>
+              <w:spacing w:before="0" w:after="0" w:line="264" w:lineRule="exact"/>
+              <w:ind w:left="0" w:firstLine="0"/>
+              <w:jc w:val="right"/>
             </w:pPr>
             <w:r>
               <w:t xml:space="preserve">Debtors.</w:t>
@@ -97,24 +140,257 @@
           </w:p>
           <w:p>
             <w:pPr>
-              <w:pStyle w:val="CaptionSingle"/>
+              <w:spacing w:before="264" w:after="0" w:line="264" w:lineRule="exact"/>
+              <w:ind w:left="0" w:firstLine="0"/>
+              <w:jc w:val="left"/>
             </w:pPr>
             <w:r>
-              <w:t xml:space="preserve">MARGIE GENIECE FRANKS;</w:t>
+              <w:t xml:space="preserve">MARGIE</w:t>
+            </w:r>
+            <w:r>
+              <w:t xml:space="preserve"> </w:t>
+            </w:r>
+            <w:r>
+              <w:t xml:space="preserve">GENIECE</w:t>
+            </w:r>
+            <w:r>
+              <w:t xml:space="preserve"> </w:t>
+            </w:r>
+            <w:r>
+              <w:t xml:space="preserve">FRANKS;</w:t>
             </w:r>
           </w:p>
           <w:p>
             <w:pPr>
-              <w:pStyle w:val="CaptionSingle"/>
+              <w:spacing w:before="0" w:after="0" w:line="264" w:lineRule="exact"/>
+              <w:ind w:left="0" w:firstLine="0"/>
+              <w:jc w:val="left"/>
             </w:pPr>
             <w:r>
-              <w:t xml:space="preserve">BENNY REX HARPER AND MARTHA RUTH HARPER, TRUSTEES OF THE BENNY AND MARTHA HARPER TRUST NUMBER ONE; ESTATE OF WILLIAM (DUB) HENRY HARPER; KATHLYNNE PLUEGHOFT; SUE ANN BLEDSO; STEVEN LEE BUCKLEY; LISA DICKEY; and JOHN MICHAEL BURNETT</w:t>
+              <w:t xml:space="preserve">BENNY</w:t>
+            </w:r>
+            <w:r>
+              <w:t xml:space="preserve"> </w:t>
+            </w:r>
+            <w:r>
+              <w:t xml:space="preserve">REX</w:t>
+            </w:r>
+            <w:r>
+              <w:t xml:space="preserve"> </w:t>
+            </w:r>
+            <w:r>
+              <w:t xml:space="preserve">HARPER</w:t>
+            </w:r>
+            <w:r>
+              <w:t xml:space="preserve"> </w:t>
+            </w:r>
+            <w:r>
+              <w:t xml:space="preserve">AND</w:t>
+            </w:r>
+            <w:r>
+              <w:t xml:space="preserve"> </w:t>
+            </w:r>
+            <w:r>
+              <w:t xml:space="preserve">MARTHA</w:t>
+            </w:r>
+            <w:r>
+              <w:t xml:space="preserve"> </w:t>
+            </w:r>
+            <w:r>
+              <w:t xml:space="preserve">RUTH</w:t>
+            </w:r>
+            <w:r>
+              <w:t xml:space="preserve"> </w:t>
+            </w:r>
+            <w:r>
+              <w:t xml:space="preserve">HARPER,</w:t>
+            </w:r>
+            <w:r>
+              <w:t xml:space="preserve"> </w:t>
+            </w:r>
+            <w:r>
+              <w:t xml:space="preserve">TRUSTEES</w:t>
+            </w:r>
+            <w:r>
+              <w:t xml:space="preserve"> </w:t>
+            </w:r>
+            <w:r>
+              <w:t xml:space="preserve">OF</w:t>
+            </w:r>
+            <w:r>
+              <w:t xml:space="preserve"> </w:t>
+            </w:r>
+            <w:r>
+              <w:t xml:space="preserve">THE</w:t>
+            </w:r>
+            <w:r>
+              <w:t xml:space="preserve"> </w:t>
+            </w:r>
+            <w:r>
+              <w:t xml:space="preserve">BENNY</w:t>
+            </w:r>
+            <w:r>
+              <w:t xml:space="preserve"> </w:t>
+            </w:r>
+            <w:r>
+              <w:t xml:space="preserve">AND</w:t>
+            </w:r>
+            <w:r>
+              <w:t xml:space="preserve"> </w:t>
+            </w:r>
+            <w:r>
+              <w:t xml:space="preserve">MARTHA</w:t>
+            </w:r>
+            <w:r>
+              <w:t xml:space="preserve"> </w:t>
+            </w:r>
+            <w:r>
+              <w:t xml:space="preserve">HARPER</w:t>
+            </w:r>
+            <w:r>
+              <w:t xml:space="preserve"> </w:t>
+            </w:r>
+            <w:r>
+              <w:t xml:space="preserve">TRUST</w:t>
+            </w:r>
+            <w:r>
+              <w:t xml:space="preserve"> </w:t>
+            </w:r>
+            <w:r>
+              <w:t xml:space="preserve">NUMBER</w:t>
+            </w:r>
+            <w:r>
+              <w:t xml:space="preserve"> </w:t>
+            </w:r>
+            <w:r>
+              <w:t xml:space="preserve">ONE;</w:t>
+            </w:r>
+            <w:r>
+              <w:t xml:space="preserve"> </w:t>
+            </w:r>
+            <w:r>
+              <w:t xml:space="preserve">ESTATE</w:t>
+            </w:r>
+            <w:r>
+              <w:t xml:space="preserve"> </w:t>
+            </w:r>
+            <w:r>
+              <w:t xml:space="preserve">OF</w:t>
+            </w:r>
+            <w:r>
+              <w:t xml:space="preserve"> </w:t>
+            </w:r>
+            <w:r>
+              <w:t xml:space="preserve">WILLIAM</w:t>
+            </w:r>
+            <w:r>
+              <w:t xml:space="preserve"> </w:t>
+            </w:r>
+            <w:r>
+              <w:t xml:space="preserve">(DUB)</w:t>
+            </w:r>
+            <w:r>
+              <w:t xml:space="preserve"> </w:t>
+            </w:r>
+            <w:r>
+              <w:t xml:space="preserve">HENRY</w:t>
+            </w:r>
+            <w:r>
+              <w:t xml:space="preserve"> </w:t>
+            </w:r>
+            <w:r>
+              <w:t xml:space="preserve">HARPER;</w:t>
+            </w:r>
+            <w:r>
+              <w:t xml:space="preserve"> </w:t>
+            </w:r>
+            <w:r>
+              <w:t xml:space="preserve">KATHLYNNE</w:t>
+            </w:r>
+            <w:r>
+              <w:t xml:space="preserve"> </w:t>
+            </w:r>
+            <w:r>
+              <w:t xml:space="preserve">PLUEGHOFT;</w:t>
+            </w:r>
+            <w:r>
+              <w:t xml:space="preserve"> </w:t>
+            </w:r>
+            <w:r>
+              <w:t xml:space="preserve">SUE</w:t>
+            </w:r>
+            <w:r>
+              <w:t xml:space="preserve"> </w:t>
+            </w:r>
+            <w:r>
+              <w:t xml:space="preserve">ANN</w:t>
+            </w:r>
+            <w:r>
+              <w:t xml:space="preserve"> </w:t>
+            </w:r>
+            <w:r>
+              <w:t xml:space="preserve">BLEDSO;</w:t>
+            </w:r>
+            <w:r>
+              <w:t xml:space="preserve"> </w:t>
+            </w:r>
+            <w:r>
+              <w:t xml:space="preserve">STEVEN</w:t>
+            </w:r>
+            <w:r>
+              <w:t xml:space="preserve"> </w:t>
+            </w:r>
+            <w:r>
+              <w:t xml:space="preserve">LEE</w:t>
+            </w:r>
+            <w:r>
+              <w:t xml:space="preserve"> </w:t>
+            </w:r>
+            <w:r>
+              <w:t xml:space="preserve">BUCKLEY;</w:t>
+            </w:r>
+            <w:r>
+              <w:t xml:space="preserve"> </w:t>
+            </w:r>
+            <w:r>
+              <w:t xml:space="preserve">LISA</w:t>
+            </w:r>
+            <w:r>
+              <w:t xml:space="preserve"> </w:t>
+            </w:r>
+            <w:r>
+              <w:t xml:space="preserve">DICKEY;</w:t>
+            </w:r>
+            <w:r>
+              <w:t xml:space="preserve"> </w:t>
+            </w:r>
+            <w:r>
+              <w:t xml:space="preserve">and</w:t>
+            </w:r>
+            <w:r>
+              <w:t xml:space="preserve"> </w:t>
+            </w:r>
+            <w:r>
+              <w:t xml:space="preserve">JOHN</w:t>
+            </w:r>
+            <w:r>
+              <w:t xml:space="preserve"> </w:t>
+            </w:r>
+            <w:r>
+              <w:t xml:space="preserve">MICHAEL</w:t>
+            </w:r>
+            <w:r>
+              <w:t xml:space="preserve"> </w:t>
+            </w:r>
+            <w:r>
+              <w:t xml:space="preserve">BURNETT</w:t>
             </w:r>
           </w:p>
           <w:p>
             <w:pPr>
-              <w:pStyle w:val="CaptionRight"/>
-              <w:spacing w:before="0" w:after="264"/>
+              <w:spacing w:before="0" w:after="0" w:line="264" w:lineRule="exact"/>
+              <w:ind w:left="0" w:firstLine="0"/>
+              <w:jc w:val="right"/>
             </w:pPr>
             <w:r>
               <w:t xml:space="preserve">PLAINTIFFS</w:t>
@@ -122,8 +398,9 @@
           </w:p>
           <w:p>
             <w:pPr>
-              <w:pStyle w:val="CaptionCentered"/>
-              <w:spacing w:before="0" w:after="264"/>
+              <w:spacing w:before="264" w:after="264" w:line="264" w:lineRule="exact"/>
+              <w:ind w:left="0" w:firstLine="0"/>
+              <w:jc w:val="center"/>
             </w:pPr>
             <w:r>
               <w:t xml:space="preserve">v.</w:t>
@@ -131,15 +408,55 @@
           </w:p>
           <w:p>
             <w:pPr>
-              <w:pStyle w:val="CaptionSingle"/>
+              <w:spacing w:before="0" w:after="0" w:line="264" w:lineRule="exact"/>
+              <w:ind w:left="0" w:firstLine="0"/>
+              <w:jc w:val="left"/>
             </w:pPr>
             <w:r>
-              <w:t xml:space="preserve">BRUCE WATKINS, II AND HEIDA FARQUE WATKINS</w:t>
+              <w:t xml:space="preserve">BRUCE</w:t>
+            </w:r>
+            <w:r>
+              <w:t xml:space="preserve"> </w:t>
+            </w:r>
+            <w:r>
+              <w:t xml:space="preserve">WATKINS,</w:t>
+            </w:r>
+            <w:r>
+              <w:t xml:space="preserve"> </w:t>
+            </w:r>
+            <w:r>
+              <w:t xml:space="preserve">II</w:t>
+            </w:r>
+            <w:r>
+              <w:t xml:space="preserve"> </w:t>
+            </w:r>
+            <w:r>
+              <w:t xml:space="preserve">AND</w:t>
+            </w:r>
+            <w:r>
+              <w:t xml:space="preserve"> </w:t>
+            </w:r>
+            <w:r>
+              <w:t xml:space="preserve">HEIDA</w:t>
+            </w:r>
+            <w:r>
+              <w:t xml:space="preserve"> </w:t>
+            </w:r>
+            <w:r>
+              <w:t xml:space="preserve">FARQUE</w:t>
+            </w:r>
+            <w:r>
+              <w:t xml:space="preserve"> </w:t>
+            </w:r>
+            <w:r>
+              <w:t xml:space="preserve">WATKINS</w:t>
             </w:r>
           </w:p>
           <w:p>
             <w:pPr>
-              <w:pStyle w:val="CaptionRight"/>
+              <w:spacing w:before="0" w:after="0" w:line="264" w:lineRule="exact"/>
+              <w:ind w:left="0" w:firstLine="0"/>
+              <w:jc w:val="right"/>
             </w:pPr>
             <w:r>
               <w:t xml:space="preserve">DEFENDANTS</w:t>
@@ -149,21 +466,29 @@
         <w:tc>
           <w:tcPr>
             <w:tcW w:w="4320" w:type="dxa"/>
-            <w:vAlign w:val="center"/>
+            <w:tcMar>
+              <w:left w:w="360" w:type="dxa"/>
+              <w:bottom w:w="216" w:type="dxa"/>
+            </w:tcMar>
+            <w:vAlign w:val="bottom"/>
           </w:tcPr>
           <w:p>
             <w:pPr>
-              <w:pStyle w:val="CaptionCase"/>
-              <w:spacing w:before="0" w:after="216"/>
+              <w:spacing w:before="0" w:after="0" w:line="264" w:lineRule="exact"/>
+              <w:ind w:left="0" w:firstLine="0"/>
+              <w:jc w:val="left"/>
             </w:pPr>
             <w:r>
-              <w:t xml:space="preserve">Case No. 4:25-bk-10241</w:t>
+              <w:t xml:space="preserve">Case No. 4:25-bk</w:t>
+              <w:noBreakHyphen/>
+              <w:t xml:space="preserve">10241</w:t>
             </w:r>
           </w:p>
           <w:p>
             <w:pPr>
-              <w:pStyle w:val="CaptionCase"/>
-              <w:spacing w:before="0" w:after="216"/>
+              <w:spacing w:before="264" w:after="0" w:line="264" w:lineRule="exact"/>
+              <w:ind w:left="0" w:firstLine="0"/>
+              <w:jc w:val="left"/>
             </w:pPr>
             <w:r>
               <w:t xml:space="preserve">Chapter 7</w:t>
@@ -171,7 +496,9 @@
           </w:p>
           <w:p>
             <w:pPr>
-              <w:pStyle w:val="CaptionCase"/>
+              <w:spacing w:before="264" w:after="0" w:line="264" w:lineRule="exact"/>
+              <w:ind w:left="0" w:firstLine="0"/>
+              <w:jc w:val="left"/>
             </w:pPr>
             <w:r>
               <w:t xml:space="preserve">Adv. Proc. No. </w:t>
@@ -182,11 +509,170 @@
     </w:tbl>
     <w:p>
       <w:pPr>
-        <w:pStyle w:val="CaptionHeading"/>
-        <w:spacing w:before="384" w:after="240"/>
-      </w:pPr>
-      <w:r>
-        <w:t xml:space="preserve">Complaint to Determine Dischargeability of Debt Pursuant to 11 U.S.C. § 523(a)(6)</w:t>
+        <w:spacing w:before="384" w:after="288" w:line="264" w:lineRule="exact"/>
+        <w:ind w:left="0" w:firstLine="0"/>
+        <w:jc w:val="center"/>
+      </w:pPr>
+      <w:r>
+        <w:rPr>
+          <w:b/>
+          <w:bCs/>
+        </w:rPr>
+        <w:t xml:space="preserve">Complaint</w:t>
+      </w:r>
+      <w:r>
+        <w:rPr>
+          <w:b/>
+          <w:bCs/>
+        </w:rPr>
+        <w:t xml:space="preserve"> </w:t>
+      </w:r>
+      <w:r>
+        <w:rPr>
+          <w:b/>
+          <w:bCs/>
+        </w:rPr>
+        <w:t xml:space="preserve">to</w:t>
+      </w:r>
+      <w:r>
+        <w:rPr>
+          <w:b/>
+          <w:bCs/>
+        </w:rPr>
+        <w:t xml:space="preserve"> </w:t>
+      </w:r>
+      <w:r>
+        <w:rPr>
+          <w:b/>
+          <w:bCs/>
+        </w:rPr>
+        <w:t xml:space="preserve">Determine</w:t>
+      </w:r>
+      <w:r>
+        <w:rPr>
+          <w:b/>
+          <w:bCs/>
+        </w:rPr>
+        <w:t xml:space="preserve"> </w:t>
+      </w:r>
+      <w:r>
+        <w:rPr>
+          <w:b/>
+          <w:bCs/>
+        </w:rPr>
+        <w:t xml:space="preserve">Dischargeability</w:t>
+      </w:r>
+      <w:r>
+        <w:rPr>
+          <w:b/>
+          <w:bCs/>
+        </w:rPr>
+        <w:t xml:space="preserve"> </w:t>
+      </w:r>
+      <w:r>
+        <w:rPr>
+          <w:b/>
+          <w:bCs/>
+        </w:rPr>
+        <w:t xml:space="preserve">of</w:t>
+      </w:r>
+      <w:r>
+        <w:rPr>
+          <w:b/>
+          <w:bCs/>
+        </w:rPr>
+        <w:t xml:space="preserve"> </w:t>
+      </w:r>
+      <w:r>
+        <w:rPr>
+          <w:b/>
+          <w:bCs/>
+        </w:rPr>
+        <w:t xml:space="preserve">Debt</w:t>
+      </w:r>
+      <w:r>
+        <w:rPr>
+          <w:b/>
+          <w:bCs/>
+        </w:rPr>
+        <w:t xml:space="preserve"> </w:t>
+      </w:r>
+      <w:r>
+        <w:rPr>
+          <w:b/>
+          <w:bCs/>
+        </w:rPr>
+        <w:t xml:space="preserve">Pursuant</w:t>
+      </w:r>
+      <w:r>
+        <w:rPr>
+          <w:b/>
+          <w:bCs/>
+        </w:rPr>
+        <w:t xml:space="preserve"> </w:t>
+      </w:r>
+      <w:r>
+        <w:rPr>
+          <w:b/>
+          <w:bCs/>
+        </w:rPr>
+        <w:t xml:space="preserve">to</w:t>
+      </w:r>
+      <w:r>
+        <w:rPr>
+          <w:b/>
+          <w:bCs/>
+        </w:rPr>
+        <w:t xml:space="preserve"> </w:t>
+      </w:r>
+      <w:r>
+        <w:rPr>
+          <w:b/>
+          <w:bCs/>
+        </w:rPr>
+        <w:t xml:space="preserve">11</w:t>
+      </w:r>
+      <w:r>
+        <w:rPr>
+          <w:b/>
+          <w:bCs/>
+        </w:rPr>
+        <w:t xml:space="preserve"> </w:t>
+      </w:r>
+      <w:r>
+        <w:rPr>
+          <w:b/>
+          <w:bCs/>
+        </w:rPr>
+        <w:t xml:space="preserve">U.S.C.</w:t>
+      </w:r>
+      <w:r>
+        <w:rPr>
+          <w:b/>
+          <w:bCs/>
+        </w:rPr>
+        <w:t xml:space="preserve"> </w:t>
+      </w:r>
+      <w:r>
+        <w:rPr>
+          <w:b/>
+          <w:bCs/>
+        </w:rPr>
+        <w:t xml:space="preserve">§</w:t>
+      </w:r>
+      <w:r>
+        <w:rPr>
+          <w:b/>
+          <w:bCs/>
+        </w:rPr>
+        <w:t xml:space="preserve"> </w:t>
+      </w:r>
+      <w:r>
+        <w:rPr>
+          <w:b/>
+          <w:bCs/>
+        </w:rPr>
+        <w:t xml:space="preserve">523(a)⁠(6)</w:t>
       </w:r>
     </w:p>
     <w:p>
@@ -194,35 +680,36 @@
         <w:pStyle w:val="FirstParagraph"/>
       </w:pPr>
       <w:r>
-        <w:t xml:space="preserve">The Plaintiffs, by and through their attorneys Lax, Vaughan, Fortson, Rowe, &amp; Threet, P.A., for their complaint to determine dischargeability of debt pursuant to 11 U.S.C. § 523(a)(6) combined with objection to discharge pursuant to 11 U.S.C. § 727(a)(6)(A), states as follows:</w:t>
-      </w:r>
-    </w:p>
-    <w:bookmarkStart w:id="20" w:name="i.-jurisdiction"/>
+        <w:t xml:space="preserve">The Plaintiffs, by and through their attorneys Lax, Vaughan, Fortson, Rowe, &amp; Threet, P.A., for their complaint to determine dischargeability of debt pursuant to 11 U.S.C. § 523(a)⁠(6) combined with objection to discharge pursuant to 11 U.S.C. § 727(a)⁠(6)⁠(A), states as follows:</w:t>
+      </w:r>
+    </w:p>
     <w:p>
       <w:pPr>
         <w:pStyle w:val="Heading1"/>
       </w:pPr>
+      <w:bookmarkStart w:id="9" w:name="_db37184aa93d6d69e94b3be7bf7ac544d5d855d"/>
       <w:r>
         <w:t xml:space="preserve">I. Jurisdiction</w:t>
       </w:r>
+      <w:bookmarkEnd w:id="9"/>
     </w:p>
     <w:p>
       <w:pPr>
         <w:pStyle w:val="NumberedParagraph"/>
       </w:pPr>
       <w:r>
-        <w:t xml:space="preserve">1. The Court has jurisdiction over the subject matter and parties to this action pursuant to 28 U.S.C. § 1334 and 28 U.S.C. § 157. This is a core proceeding pursuant to 28 U.S.C. § 157(b)(2)(I). The Court has the power and authority to enter a final order in this proceeding.</w:t>
-      </w:r>
-    </w:p>
-    <w:bookmarkEnd w:id="20"/>
-    <w:bookmarkStart w:id="21" w:name="ii.-the-parties"/>
+        <w:t xml:space="preserve">1. The Court has jurisdiction over the subject matter and parties to this action pursuant to 28 U.S.C. § 1334 and 28 U.S.C. § 157. This is a core proceeding pursuant to 28 U.S.C. § 157(b)⁠(2)⁠(I). The Court has the power and authority to enter a final order in this proceeding.</w:t>
+      </w:r>
+    </w:p>
     <w:p>
       <w:pPr>
         <w:pStyle w:val="Heading1"/>
       </w:pPr>
+      <w:bookmarkStart w:id="10" w:name="_ddb87d4a097d12e27489904954a4517db4759f7"/>
       <w:r>
         <w:t xml:space="preserve">II. The Parties</w:t>
       </w:r>
+      <w:bookmarkEnd w:id="10"/>
     </w:p>
     <w:p>
       <w:pPr>
@@ -249,24 +736,25 @@
         <w:t xml:space="preserve">), are each an individual and resident of Van Buren County, Arkansas, and are the debtors in the lead bankruptcy proceeding.</w:t>
       </w:r>
     </w:p>
-    <w:bookmarkEnd w:id="21"/>
-    <w:bookmarkStart w:id="23" w:name="iii.-facts"/>
     <w:p>
       <w:pPr>
         <w:pStyle w:val="Heading1"/>
       </w:pPr>
+      <w:bookmarkStart w:id="11" w:name="_2d51dc06476a32fcb6518afce56f008d465a147"/>
       <w:r>
         <w:t xml:space="preserve">III. Facts</w:t>
       </w:r>
-    </w:p>
-    <w:bookmarkStart w:id="22" w:name="a.-background-pre-bankruptcy"/>
+      <w:bookmarkEnd w:id="11"/>
+    </w:p>
     <w:p>
       <w:pPr>
         <w:pStyle w:val="Heading2"/>
       </w:pPr>
+      <w:bookmarkStart w:id="12" w:name="_a00006fc1d90b5e6847c4c9cc9d769730389942"/>
       <w:r>
         <w:t xml:space="preserve">A. Background Pre-Bankruptcy</w:t>
       </w:r>
+      <w:bookmarkEnd w:id="12"/>
     </w:p>
     <w:p>
       <w:pPr>
@@ -356,7 +844,19 @@
         <w:t xml:space="preserve">“State Court”</w:t>
       </w:r>
       <w:r>
-        <w:t xml:space="preserve">) as Case No. 71CV-22-116 (the</w:t>
+        <w:t xml:space="preserve">) as Case No. 71CV</w:t>
+      </w:r>
+      <w:r>
+        <w:noBreakHyphen/>
+      </w:r>
+      <w:r>
+        <w:t xml:space="preserve">22</w:t>
+      </w:r>
+      <w:r>
+        <w:noBreakHyphen/>
+      </w:r>
+      <w:r>
+        <w:t xml:space="preserve">116 (the</w:t>
       </w:r>
       <w:r>
         <w:t xml:space="preserve"> </w:t>
@@ -389,7 +889,7 @@
         <w:pStyle w:val="NumberedParagraph"/>
       </w:pPr>
       <w:r>
-        <w:t xml:space="preserve">14. Ms. Nuckles intervened in the State Court Litigation, filing her own petition seeking a preliminary injunction against the Debtors.</w:t>
+        <w:t xml:space="preserve">14. Ms. Nuckles intervened in the State Court Litigation, filing her own petition seeking a preliminary injunction against the Debtors.</w:t>
       </w:r>
     </w:p>
     <w:p>
@@ -397,7 +897,7 @@
         <w:pStyle w:val="NumberedParagraph"/>
       </w:pPr>
       <w:r>
-        <w:t xml:space="preserve">15. The State Court Litigation came on for trial on August 12, 2024, but was continued to September 23, 2024 due to Mr. Watkins suffering a health episode.</w:t>
+        <w:t xml:space="preserve">15. The State Court Litigation came on for trial on August 12, 2024, but was continued to September 23, 2024 due to Mr. Watkins suffering a health episode.</w:t>
       </w:r>
     </w:p>
     <w:p>
@@ -439,7 +939,19 @@
         <w:t xml:space="preserve">“Final Judgment”</w:t>
       </w:r>
       <w:r>
-        <w:t xml:space="preserve">) in the State Court Litigation, reiterating the findings and award in the Initial Judgment, but also awarding treble damages to the Plaintiffs pursuant to A.C.A. §18-60-102, such judgment being in the face amount of $41,382.78. A copy of the Initial Judgment is attached hereto as Exhibit B, and incorporated herein by reference.</w:t>
+        <w:t xml:space="preserve">) in the State Court Litigation, reiterating the findings and award in the Initial Judgment, but also awarding treble damages to the Plaintiffs pursuant to A.C.A. §18</w:t>
+      </w:r>
+      <w:r>
+        <w:noBreakHyphen/>
+      </w:r>
+      <w:r>
+        <w:t xml:space="preserve">60</w:t>
+      </w:r>
+      <w:r>
+        <w:noBreakHyphen/>
+      </w:r>
+      <w:r>
+        <w:t xml:space="preserve">102, such judgment being in the face amount of $41,382.78. A copy of the Initial Judgment is attached hereto as Exhibit B, and incorporated herein by reference.</w:t>
       </w:r>
     </w:p>
     <w:p>
@@ -450,23 +962,22 @@
         <w:t xml:space="preserve">19. The Final Judgment is final and non-appealable.</w:t>
       </w:r>
     </w:p>
-    <w:bookmarkEnd w:id="22"/>
-    <w:bookmarkEnd w:id="23"/>
-    <w:bookmarkStart w:id="24" w:name="Xfcfc1d84e14e3f02c7f8a7deda42fcae966e9cf"/>
     <w:p>
       <w:pPr>
         <w:pStyle w:val="Heading1"/>
       </w:pPr>
-      <w:r>
-        <w:t xml:space="preserve">IV. Complaint to Determine Dischargeability of Debt Pursuant to Section 523(a)(6)</w:t>
-      </w:r>
+      <w:bookmarkStart w:id="13" w:name="_fcfc1d84e14e3f02c7f8a7deda42fcae966e9cf"/>
+      <w:r>
+        <w:t xml:space="preserve">IV. Complaint to Determine Dischargeability of Debt Pursuant to Section 523(a)⁠(6)</w:t>
+      </w:r>
+      <w:bookmarkEnd w:id="13"/>
     </w:p>
     <w:p>
       <w:pPr>
         <w:pStyle w:val="NumberedParagraph"/>
       </w:pPr>
       <w:r>
-        <w:t xml:space="preserve">20. 11 U.S.C. § 523(a)(6) provides that a debt is not discharged if the debt is</w:t>
+        <w:t xml:space="preserve">20. 11 U.S.C. § 523(a)⁠(6) provides that a debt is not discharged if the debt is</w:t>
       </w:r>
       <w:r>
         <w:t xml:space="preserve"> </w:t>
@@ -478,7 +989,7 @@
         <w:t xml:space="preserve"> </w:t>
       </w:r>
       <w:r>
-        <w:t xml:space="preserve">11 U.S.C. § 523(a)(6). The Debtors are not entitled to discharge the claims of the Plaintiffs pursuant to 11 U.S.C. § 523(a)(6) due to the willful and malicious injury by the Debtors to the Harpers.</w:t>
+        <w:t xml:space="preserve">11 U.S.C. § 523(a)⁠(6). The Debtors are not entitled to discharge the claims of the Plaintiffs pursuant to 11 U.S.C. § 523(a)⁠(6) due to the willful and malicious injury by the Debtors to the Harpers.</w:t>
       </w:r>
     </w:p>
     <w:p>
@@ -562,7 +1073,19 @@
         <w:pStyle w:val="NumberedParagraph"/>
       </w:pPr>
       <w:r>
-        <w:t xml:space="preserve">26. Additionally, the Plaintiffs were awarded treble damages in the case against the debtors for this trespass. Under Ark. Code Ann. § 18-60-102(a) treble damages require a showing of intentional wrongdoing, which may be inferred from knowing or reckless conduct. Auger Timber Co., Inc. v. Jiles, 56 S.W.3d 386, 389 (Ark. App. 2001).</w:t>
+        <w:t xml:space="preserve">26. Additionally, the Plaintiffs were awarded treble damages in the case against the debtors for this trespass. Under Ark. Code Ann. § 18</w:t>
+      </w:r>
+      <w:r>
+        <w:noBreakHyphen/>
+      </w:r>
+      <w:r>
+        <w:t xml:space="preserve">60</w:t>
+      </w:r>
+      <w:r>
+        <w:noBreakHyphen/>
+      </w:r>
+      <w:r>
+        <w:t xml:space="preserve">102(a) treble damages require a showing of intentional wrongdoing, which may be inferred from knowing or reckless conduct. Auger Timber Co., Inc. v. Jiles, 56 S.W.3d 386, 389 (Ark. App. 2001).</w:t>
       </w:r>
     </w:p>
     <w:p>
@@ -570,7 +1093,7 @@
         <w:pStyle w:val="NumberedParagraph"/>
       </w:pPr>
       <w:r>
-        <w:t xml:space="preserve">27. The Debtors should be denied a discharge as to the claims of the Plaintiffs awarded, and to be awarded, in the State Court Litigation, including in Initial Judgment and the Final Judgment, pursuant to 11 U.S.C. § 523(a)(6). Such claims of the plaintiffs should be determined to be nondischargeable and excepted from any discharge of the Debtors.</w:t>
+        <w:t xml:space="preserve">27. The Debtors should be denied a discharge as to the claims of the Plaintiffs awarded, and to be awarded, in the State Court Litigation, including in Initial Judgment and the Final Judgment, pursuant to 11 U.S.C. § 523(a)⁠(6). Such claims of the plaintiffs should be determined to be nondischargeable and excepted from any discharge of the Debtors.</w:t>
       </w:r>
     </w:p>
     <w:p>
@@ -586,31 +1109,34 @@
         <w:pStyle w:val="NumberedParagraph"/>
       </w:pPr>
       <w:r>
-        <w:t xml:space="preserve">29. The Plaintiffs should be entitled to an additional judgment for their attorneys’ fees and costs incurred in this Adversary Proceeding and in the lead bankruptcy case. Such award should be determined to be non-dischargeable under 11 U.S.C. § 523(a)(6).</w:t>
-      </w:r>
-    </w:p>
-    <w:bookmarkEnd w:id="24"/>
-    <w:bookmarkStart w:id="25" w:name="v.-prayer-for-relief"/>
+        <w:t xml:space="preserve">29. The Plaintiffs should be entitled to an additional judgment for their attorneys’ fees and costs incurred in this Adversary Proceeding and in the lead bankruptcy case. Such award should be determined to be non-dischargeable under 11 U.S.C. § 523(a)⁠(6).</w:t>
+      </w:r>
+    </w:p>
     <w:p>
       <w:pPr>
         <w:pStyle w:val="Heading1"/>
       </w:pPr>
+      <w:bookmarkStart w:id="14" w:name="_ee235ffc0f2b3f81875395436066a990379bc07"/>
       <w:r>
         <w:t xml:space="preserve">V. Prayer for Relief</w:t>
       </w:r>
+      <w:bookmarkEnd w:id="14"/>
     </w:p>
     <w:p>
       <w:pPr>
         <w:pStyle w:val="FirstParagraph"/>
       </w:pPr>
       <w:r>
-        <w:t xml:space="preserve">WHEREFORE, for the reasons stated above, the Plaintiffs Margie Geniece Franks; Benny Rex Harper and Martha Ruth Harper, Trustees of the Benny and Martha Harper Trust Number One; Estate of William (DUB) Henry Harper; Kathlynne Plueghoft; Sue Ann Bledso; Steven Lee Buckley; Lisa Dickey; and John Michael Burnett pray that their claims against the Debtors, including the claims awarded, and to be awarded, to Plaintiffs in the State Court Litigation, including the Initial Judgment and the Final Judgment, be declared nondischargeable pursuant to 11 U.S.C. § 523(a)(6); that the claims of the Plaintiffs be excepted from any discharge of the Debtors; that the Plaintiffs be awarded their attorneys fees and costs incurred in this Adversary Proceeding and in the lead bankruptcy case, and that the same be determined to be non-dischargeable pursuant to 11 U.S.C. § 523(a)(6); and for all other just and proper relief to which they may be entitled.</w:t>
-      </w:r>
-    </w:p>
-    <w:p>
-      <w:pPr>
-        <w:pStyle w:val="SignatureBlock"/>
-        <w:spacing w:before="0" w:after="216"/>
+        <w:t xml:space="preserve">WHEREFORE, for the reasons stated above, the Plaintiffs Margie Geniece Franks; Benny Rex Harper and Martha Ruth Harper, Trustees of the Benny and Martha Harper Trust Number One; Estate of William (DUB) Henry Harper; Kathlynne Plueghoft; Sue Ann Bledso; Steven Lee Buckley; Lisa Dickey; and John Michael Burnett pray that their claims against the Debtors, including the claims awarded, and to be awarded, to Plaintiffs in the State Court Litigation, including the Initial Judgment and the Final Judgment, be declared nondischargeable pursuant to 11 U.S.C. § 523(a)⁠(6); that the claims of the Plaintiffs be excepted from any discharge of the Debtors; that the Plaintiffs be awarded their attorneys fees and costs incurred in this Adversary Proceeding and in the lead bankruptcy case, and that the same be determined to be non-dischargeable pursuant to 11 U.S.C. § 523(a)⁠(6); and for all other just and proper relief to which they may be entitled.</w:t>
+      </w:r>
+    </w:p>
+    <w:p>
+      <w:pPr>
+        <w:keepNext/>
+        <w:keepLines/>
+        <w:spacing w:before="288" w:after="216" w:line="264" w:lineRule="exact"/>
+        <w:ind w:left="4752" w:firstLine="0"/>
+        <w:jc w:val="left"/>
       </w:pPr>
       <w:r>
         <w:t xml:space="preserve">Respectfully submitted,</w:t>
@@ -618,7 +1144,11 @@
     </w:p>
     <w:p>
       <w:pPr>
-        <w:pStyle w:val="SignatureBlock"/>
+        <w:keepNext/>
+        <w:keepLines/>
+        <w:spacing w:before="0" w:after="0" w:line="264" w:lineRule="exact"/>
+        <w:ind w:left="4752" w:firstLine="0"/>
+        <w:jc w:val="left"/>
       </w:pPr>
       <w:r>
         <w:t xml:space="preserve">s/ Branch T. Fields</w:t>
@@ -626,61 +1156,370 @@
     </w:p>
     <w:p>
       <w:pPr>
-        <w:pStyle w:val="SignatureBlock"/>
-      </w:pPr>
-      <w:r>
-        <w:t xml:space="preserve">Attorneys for Plaintiffs</w:t>
-      </w:r>
-    </w:p>
-    <w:p>
-      <w:pPr>
-        <w:pStyle w:val="CaptionSingle"/>
-        <w:spacing w:before="360" w:after="0"/>
-      </w:pPr>
-      <w:r>
-        <w:t xml:space="preserve">Branch T. Fields (2008143)</w:t>
-      </w:r>
-    </w:p>
-    <w:p>
-      <w:pPr>
-        <w:pStyle w:val="CaptionSingle"/>
-      </w:pPr>
-      <w:r>
-        <w:t xml:space="preserve">Lax, Vaughan, Fortson, Rowe &amp; Threet, P.A.</w:t>
-      </w:r>
-    </w:p>
-    <w:p>
-      <w:pPr>
-        <w:pStyle w:val="CaptionSingle"/>
-      </w:pPr>
-      <w:r>
-        <w:t xml:space="preserve">Cantrell West Building, 11300 Cantrell Road, Suite 201</w:t>
-      </w:r>
-    </w:p>
-    <w:p>
-      <w:pPr>
-        <w:pStyle w:val="CaptionSingle"/>
-      </w:pPr>
-      <w:r>
-        <w:t xml:space="preserve">Little Rock, AR 72212</w:t>
-      </w:r>
-    </w:p>
-    <w:p>
-      <w:pPr>
-        <w:pStyle w:val="CaptionSingle"/>
-      </w:pPr>
-      <w:r>
-        <w:t xml:space="preserve">(501) 376-6565</w:t>
-      </w:r>
-    </w:p>
-    <w:bookmarkEnd w:id="25"/>
+        <w:spacing w:before="0" w:after="0" w:line="264" w:lineRule="exact"/>
+        <w:ind w:left="4752" w:firstLine="0"/>
+        <w:jc w:val="left"/>
+      </w:pPr>
+      <w:r>
+        <w:rPr>
+          <w:i/>
+          <w:iCs/>
+        </w:rPr>
+        <w:t xml:space="preserve">Attorneys</w:t>
+      </w:r>
+      <w:r>
+        <w:rPr>
+          <w:i/>
+          <w:iCs/>
+        </w:rPr>
+        <w:t xml:space="preserve"> </w:t>
+      </w:r>
+      <w:r>
+        <w:rPr>
+          <w:i/>
+          <w:iCs/>
+        </w:rPr>
+        <w:t xml:space="preserve">for</w:t>
+      </w:r>
+      <w:r>
+        <w:rPr>
+          <w:i/>
+          <w:iCs/>
+        </w:rPr>
+        <w:t xml:space="preserve"> </w:t>
+      </w:r>
+      <w:r>
+        <w:rPr>
+          <w:i/>
+          <w:iCs/>
+        </w:rPr>
+        <w:t xml:space="preserve">Plaintiffs</w:t>
+      </w:r>
+    </w:p>
+    <w:p>
+      <w:pPr>
+        <w:keepNext/>
+        <w:keepLines/>
+        <w:spacing w:before="360" w:after="0" w:line="264" w:lineRule="exact"/>
+        <w:ind w:left="0" w:firstLine="0"/>
+        <w:jc w:val="left"/>
+      </w:pPr>
+      <w:r>
+        <w:t xml:space="preserve">Branch</w:t>
+      </w:r>
+      <w:r>
+        <w:t xml:space="preserve"> </w:t>
+      </w:r>
+      <w:r>
+        <w:t xml:space="preserve">T.</w:t>
+      </w:r>
+      <w:r>
+        <w:t xml:space="preserve"> </w:t>
+      </w:r>
+      <w:r>
+        <w:t xml:space="preserve">Fields</w:t>
+      </w:r>
+      <w:r>
+        <w:t xml:space="preserve"> </w:t>
+      </w:r>
+      <w:r>
+        <w:t xml:space="preserve">(2008143)</w:t>
+      </w:r>
+    </w:p>
+    <w:p>
+      <w:pPr>
+        <w:keepNext/>
+        <w:keepLines/>
+        <w:spacing w:before="0" w:after="0" w:line="264" w:lineRule="exact"/>
+        <w:ind w:left="0" w:firstLine="0"/>
+        <w:jc w:val="left"/>
+      </w:pPr>
+      <w:r>
+        <w:rPr>
+          <w:i/>
+          <w:iCs/>
+        </w:rPr>
+        <w:t xml:space="preserve">Lax,</w:t>
+      </w:r>
+      <w:r>
+        <w:rPr>
+          <w:i/>
+          <w:iCs/>
+        </w:rPr>
+        <w:t xml:space="preserve"> </w:t>
+      </w:r>
+      <w:r>
+        <w:rPr>
+          <w:i/>
+          <w:iCs/>
+        </w:rPr>
+        <w:t xml:space="preserve">Vaughan,</w:t>
+      </w:r>
+      <w:r>
+        <w:rPr>
+          <w:i/>
+          <w:iCs/>
+        </w:rPr>
+        <w:t xml:space="preserve"> </w:t>
+      </w:r>
+      <w:r>
+        <w:rPr>
+          <w:i/>
+          <w:iCs/>
+        </w:rPr>
+        <w:t xml:space="preserve">Fortson,</w:t>
+      </w:r>
+      <w:r>
+        <w:rPr>
+          <w:i/>
+          <w:iCs/>
+        </w:rPr>
+        <w:t xml:space="preserve"> </w:t>
+      </w:r>
+      <w:r>
+        <w:rPr>
+          <w:i/>
+          <w:iCs/>
+        </w:rPr>
+        <w:t xml:space="preserve">Rowe</w:t>
+      </w:r>
+      <w:r>
+        <w:rPr>
+          <w:i/>
+          <w:iCs/>
+        </w:rPr>
+        <w:t xml:space="preserve"> </w:t>
+      </w:r>
+      <w:r>
+        <w:rPr>
+          <w:i/>
+          <w:iCs/>
+        </w:rPr>
+        <w:t xml:space="preserve">&amp;</w:t>
+      </w:r>
+      <w:r>
+        <w:rPr>
+          <w:i/>
+          <w:iCs/>
+        </w:rPr>
+        <w:t xml:space="preserve"> </w:t>
+      </w:r>
+      <w:r>
+        <w:rPr>
+          <w:i/>
+          <w:iCs/>
+        </w:rPr>
+        <w:t xml:space="preserve">Threet,</w:t>
+      </w:r>
+      <w:r>
+        <w:rPr>
+          <w:i/>
+          <w:iCs/>
+        </w:rPr>
+        <w:t xml:space="preserve"> </w:t>
+      </w:r>
+      <w:r>
+        <w:rPr>
+          <w:i/>
+          <w:iCs/>
+        </w:rPr>
+        <w:t xml:space="preserve">P.A.</w:t>
+      </w:r>
+    </w:p>
+    <w:p>
+      <w:pPr>
+        <w:keepNext/>
+        <w:keepLines/>
+        <w:spacing w:before="0" w:after="0" w:line="264" w:lineRule="exact"/>
+        <w:ind w:left="0" w:firstLine="0"/>
+        <w:jc w:val="left"/>
+      </w:pPr>
+      <w:r>
+        <w:rPr>
+          <w:i/>
+          <w:iCs/>
+        </w:rPr>
+        <w:t xml:space="preserve">Cantrell</w:t>
+      </w:r>
+      <w:r>
+        <w:rPr>
+          <w:i/>
+          <w:iCs/>
+        </w:rPr>
+        <w:t xml:space="preserve"> </w:t>
+      </w:r>
+      <w:r>
+        <w:rPr>
+          <w:i/>
+          <w:iCs/>
+        </w:rPr>
+        <w:t xml:space="preserve">West</w:t>
+      </w:r>
+      <w:r>
+        <w:rPr>
+          <w:i/>
+          <w:iCs/>
+        </w:rPr>
+        <w:t xml:space="preserve"> </w:t>
+      </w:r>
+      <w:r>
+        <w:rPr>
+          <w:i/>
+          <w:iCs/>
+        </w:rPr>
+        <w:t xml:space="preserve">Building,</w:t>
+      </w:r>
+      <w:r>
+        <w:rPr>
+          <w:i/>
+          <w:iCs/>
+        </w:rPr>
+        <w:t xml:space="preserve"> </w:t>
+      </w:r>
+      <w:r>
+        <w:rPr>
+          <w:i/>
+          <w:iCs/>
+        </w:rPr>
+        <w:t xml:space="preserve">11300</w:t>
+      </w:r>
+      <w:r>
+        <w:rPr>
+          <w:i/>
+          <w:iCs/>
+        </w:rPr>
+        <w:t xml:space="preserve"> </w:t>
+      </w:r>
+      <w:r>
+        <w:rPr>
+          <w:i/>
+          <w:iCs/>
+        </w:rPr>
+        <w:t xml:space="preserve">Cantrell</w:t>
+      </w:r>
+      <w:r>
+        <w:rPr>
+          <w:i/>
+          <w:iCs/>
+        </w:rPr>
+        <w:t xml:space="preserve"> </w:t>
+      </w:r>
+      <w:r>
+        <w:rPr>
+          <w:i/>
+          <w:iCs/>
+        </w:rPr>
+        <w:t xml:space="preserve">Road,</w:t>
+      </w:r>
+      <w:r>
+        <w:rPr>
+          <w:i/>
+          <w:iCs/>
+        </w:rPr>
+        <w:t xml:space="preserve"> </w:t>
+      </w:r>
+      <w:r>
+        <w:rPr>
+          <w:i/>
+          <w:iCs/>
+        </w:rPr>
+        <w:t xml:space="preserve">Suite</w:t>
+      </w:r>
+      <w:r>
+        <w:rPr>
+          <w:i/>
+          <w:iCs/>
+        </w:rPr>
+        <w:t xml:space="preserve"> </w:t>
+      </w:r>
+      <w:r>
+        <w:rPr>
+          <w:i/>
+          <w:iCs/>
+        </w:rPr>
+        <w:t xml:space="preserve">201</w:t>
+      </w:r>
+    </w:p>
+    <w:p>
+      <w:pPr>
+        <w:keepNext/>
+        <w:keepLines/>
+        <w:spacing w:before="0" w:after="0" w:line="264" w:lineRule="exact"/>
+        <w:ind w:left="0" w:firstLine="0"/>
+        <w:jc w:val="left"/>
+      </w:pPr>
+      <w:r>
+        <w:rPr>
+          <w:i/>
+          <w:iCs/>
+        </w:rPr>
+        <w:t xml:space="preserve">Little</w:t>
+      </w:r>
+      <w:r>
+        <w:rPr>
+          <w:i/>
+          <w:iCs/>
+        </w:rPr>
+        <w:t xml:space="preserve"> </w:t>
+      </w:r>
+      <w:r>
+        <w:rPr>
+          <w:i/>
+          <w:iCs/>
+        </w:rPr>
+        <w:t xml:space="preserve">Rock,</w:t>
+      </w:r>
+      <w:r>
+        <w:rPr>
+          <w:i/>
+          <w:iCs/>
+        </w:rPr>
+        <w:t xml:space="preserve"> </w:t>
+      </w:r>
+      <w:r>
+        <w:rPr>
+          <w:i/>
+          <w:iCs/>
+        </w:rPr>
+        <w:t xml:space="preserve">AR</w:t>
+      </w:r>
+      <w:r>
+        <w:rPr>
+          <w:i/>
+          <w:iCs/>
+        </w:rPr>
+        <w:t xml:space="preserve"> </w:t>
+      </w:r>
+      <w:r>
+        <w:rPr>
+          <w:i/>
+          <w:iCs/>
+        </w:rPr>
+        <w:t xml:space="preserve">72212</w:t>
+      </w:r>
+    </w:p>
+    <w:p>
+      <w:pPr>
+        <w:spacing w:before="0" w:after="0" w:line="264" w:lineRule="exact"/>
+        <w:ind w:left="0" w:firstLine="0"/>
+        <w:jc w:val="left"/>
+      </w:pPr>
+      <w:r>
+        <w:t xml:space="preserve">(501)</w:t>
+      </w:r>
+      <w:r>
+        <w:t xml:space="preserve"> </w:t>
+      </w:r>
+      <w:r>
+        <w:t xml:space="preserve">376</w:t>
+        <w:noBreakHyphen/>
+        <w:t xml:space="preserve">6565</w:t>
+      </w:r>
+    </w:p>
     <w:sectPr>
-      <w:footerReference r:id="rId9" w:type="default"/>
-      <w:footnotePr>
-        <w:numRestart w:val="eachSect"/>
-      </w:footnotePr>
-      <w:pgSz w:h="15840" w:w="12240"/>
-      <w:pgMar w:bottom="1440" w:footer="800" w:gutter="0" w:header="720" w:left="1440" w:right="1440" w:top="1440"/>
+      <w:footerReference w:type="default" r:id="rIdFooter1"/>
+      <w:pgSz w:w="12240" w:h="15840"/>
+      <w:pgMar w:top="1440" w:right="1440" w:bottom="1440" w:left="1440" w:header="720" w:footer="432" w:gutter="0"/>
     </w:sectPr>
   </w:body>
 </w:document>
@@ -694,13 +1533,23 @@
 <w:ftr xmlns:w="http://schemas.openxmlformats.org/wordprocessingml/2006/main" xmlns:r="http://schemas.openxmlformats.org/officeDocument/2006/relationships">
   <w:p>
     <w:pPr>
-      <w:pStyle w:val="Footer"/>
-    </w:pPr>
-    <w:fldSimple w:instr=" PAGE ">
-      <w:r>
-        <w:t>1</w:t>
-      </w:r>
-    </w:fldSimple>
+      <w:jc w:val="center"/>
+    </w:pPr>
+    <w:r>
+      <w:fldChar w:fldCharType="begin"/>
+    </w:r>
+    <w:r>
+      <w:instrText xml:space="preserve"> PAGE </w:instrText>
+    </w:r>
+    <w:r>
+      <w:fldChar w:fldCharType="separate"/>
+    </w:r>
+    <w:r>
+      <w:t>1</w:t>
+    </w:r>
+    <w:r>
+      <w:fldChar w:fldCharType="end"/>
+    </w:r>
   </w:p>
 </w:ftr>
 </file>
@@ -813,90 +1662,182 @@
   <w:docDefaults>
     <w:rPrDefault>
       <w:rPr>
-        <w:rFonts w:ascii="EB Garamond" w:cs="EB Garamond" w:eastAsia="EB Garamond" w:hAnsi="EB Garamond"/>
+        <w:rFonts w:ascii="Times New Roman" w:hAnsi="Times New Roman" w:eastAsia="Times New Roman" w:cs="Times New Roman"/>
         <w:sz w:val="24"/>
         <w:szCs w:val="24"/>
-        <w:lang w:bidi="ar-SA" w:eastAsia="en-US" w:val="en-US"/>
+        <w:lang w:val="en-US" w:eastAsia="zh-CN" w:bidi="ar-SA"/>
       </w:rPr>
     </w:rPrDefault>
     <w:pPrDefault>
       <w:pPr>
-        <w:spacing w:after="0" w:before="0" w:line="240" w:lineRule="auto"/>
+        <w:widowControl/>
+        <w:spacing w:after="0"/>
       </w:pPr>
     </w:pPrDefault>
   </w:docDefaults>
-  <w:style w:default="1" w:styleId="Normal" w:type="paragraph">
+  <w:latentStyles w:defLockedState="0" w:defUIPriority="0" w:defSemiHidden="0" w:defUnhideWhenUsed="0" w:defQFormat="0" w:count="276"/>
+  <w:style w:type="paragraph" w:default="1" w:styleId="Normal">
     <w:name w:val="Normal"/>
     <w:qFormat/>
-    <w:rPr>
-      <w:color w:val="000000"/>
-    </w:rPr>
-  </w:style>
-  <w:style w:default="1" w:styleId="DefaultParagraphFont" w:type="character">
-    <w:name w:val="Default Paragraph Font"/>
-    <w:uiPriority w:val="1"/>
-    <w:semiHidden/>
-    <w:unhideWhenUsed/>
-  </w:style>
-  <w:style w:default="1" w:styleId="TableNormal" w:type="table">
-    <w:name w:val="Normal Table"/>
-    <w:uiPriority w:val="99"/>
-    <w:semiHidden/>
-    <w:unhideWhenUsed/>
-    <w:tblPr>
-      <w:tblInd w:type="dxa" w:w="0"/>
-      <w:tblCellMar>
-        <w:top w:type="dxa" w:w="0"/>
-        <w:left w:type="dxa" w:w="108"/>
-        <w:bottom w:type="dxa" w:w="0"/>
-        <w:right w:type="dxa" w:w="108"/>
-      </w:tblCellMar>
-    </w:tblPr>
-  </w:style>
-  <w:style w:styleId="Table" w:type="table">
-    <w:name w:val="Table"/>
-    <w:basedOn w:val="TableNormal"/>
-    <w:tblPr>
-      <w:tblBorders>
-        <w:top w:val="nil"/>
-        <w:left w:val="nil"/>
-        <w:bottom w:val="nil"/>
-        <w:right w:val="nil"/>
-        <w:insideH w:val="nil"/>
-        <w:insideV w:val="nil"/>
-      </w:tblBorders>
-    </w:tblPr>
-  </w:style>
-  <w:style w:styleId="BodyText" w:type="paragraph">
+  </w:style>
+  <w:style w:type="paragraph" w:styleId="BodyText">
     <w:name w:val="Body Text"/>
     <w:basedOn w:val="Normal"/>
+    <w:link w:val="BodyTextChar"/>
     <w:qFormat/>
     <w:pPr>
-      <w:widowControl/>
-      <w:spacing w:after="0" w:before="0" w:line="444" w:lineRule="exact"/>
-      <w:jc w:val="both"/>
-    </w:pPr>
-  </w:style>
-  <w:style w:styleId="FirstParagraph" w:type="paragraph">
+      <w:spacing w:before="0" w:after="0" w:line="444" w:lineRule="exact"/>
+      <w:ind w:firstLine="720"/>
+    </w:pPr>
+  </w:style>
+  <w:style w:type="paragraph" w:customStyle="1" w:styleId="FirstParagraph">
     <w:name w:val="First Paragraph"/>
     <w:basedOn w:val="BodyText"/>
     <w:next w:val="BodyText"/>
     <w:qFormat/>
   </w:style>
-  <w:style w:styleId="Compact" w:type="paragraph">
+  <w:style w:type="paragraph" w:customStyle="1" w:styleId="Compact">
     <w:name w:val="Compact"/>
     <w:basedOn w:val="BodyText"/>
     <w:qFormat/>
-  </w:style>
-  <w:style w:customStyle="1" w:styleId="NumberedParagraph" w:type="paragraph">
-    <w:name w:val="Numbered Paragraph"/>
-    <w:basedOn w:val="BodyText"/>
+    <w:pPr>
+      <w:spacing w:before="36" w:after="36"/>
+    </w:pPr>
+  </w:style>
+  <w:style w:type="paragraph" w:styleId="Title">
+    <w:name w:val="Title"/>
+    <w:basedOn w:val="Normal"/>
+    <w:next w:val="BodyText"/>
+    <w:link w:val="TitleChar"/>
+    <w:uiPriority w:val="10"/>
     <w:qFormat/>
-    <w:pPr>
-      <w:ind w:firstLine="720"/>
-    </w:pPr>
-  </w:style>
-  <w:style w:styleId="Heading1" w:type="paragraph">
+    <w:rsid w:val="00A10FD9"/>
+    <w:pPr>
+      <w:spacing w:after="80" w:line="240" w:lineRule="auto"/>
+      <w:contextualSpacing/>
+      <w:jc w:val="center"/>
+    </w:pPr>
+    <w:rPr>
+      <w:rFonts w:asciiTheme="majorHAnsi" w:eastAsiaTheme="majorEastAsia" w:hAnsiTheme="majorHAnsi" w:cstheme="majorBidi"/>
+      <w:sz w:val="56"/>
+      <w:szCs w:val="56"/>
+    </w:rPr>
+  </w:style>
+  <w:style w:type="character" w:customStyle="1" w:styleId="TitleChar">
+    <w:name w:val="Title Char"/>
+    <w:basedOn w:val="DefaultParagraphFont"/>
+    <w:link w:val="Title"/>
+    <w:uiPriority w:val="10"/>
+    <w:rsid w:val="00A10FD9"/>
+    <w:rPr>
+      <w:rFonts w:asciiTheme="majorHAnsi" w:eastAsiaTheme="majorEastAsia" w:hAnsiTheme="majorHAnsi" w:cstheme="majorBidi"/>
+      <w:sz w:val="56"/>
+      <w:szCs w:val="56"/>
+    </w:rPr>
+  </w:style>
+  <w:style w:type="paragraph" w:styleId="Subtitle">
+    <w:name w:val="Subtitle"/>
+    <w:basedOn w:val="Title"/>
+    <w:next w:val="BodyText"/>
+    <w:link w:val="SubtitleChar"/>
+    <w:uiPriority w:val="11"/>
+    <w:qFormat/>
+    <w:rsid w:val="00A10FD9"/>
+    <w:pPr>
+      <w:numPr>
+        <w:ilvl w:val="1"/>
+      </w:numPr>
+    </w:pPr>
+    <w:rPr>
+      <w:rFonts w:eastAsiaTheme="majorEastAsia" w:cstheme="majorBidi"/>
+      <w:spacing w:val="15"/>
+      <w:sz w:val="28"/>
+      <w:szCs w:val="28"/>
+    </w:rPr>
+  </w:style>
+  <w:style w:type="character" w:customStyle="1" w:styleId="SubtitleChar">
+    <w:name w:val="Subtitle Char"/>
+    <w:basedOn w:val="DefaultParagraphFont"/>
+    <w:link w:val="Subtitle"/>
+    <w:uiPriority w:val="11"/>
+    <w:rsid w:val="00A10FD9"/>
+    <w:rPr>
+      <w:rFonts w:eastAsiaTheme="majorEastAsia" w:cstheme="majorBidi"/>
+      <w:color w:val="595959" w:themeColor="text1" w:themeTint="A6"/>
+      <w:spacing w:val="15"/>
+      <w:sz w:val="28"/>
+      <w:szCs w:val="28"/>
+    </w:rPr>
+  </w:style>
+  <w:style w:type="paragraph" w:customStyle="1" w:styleId="Author">
+    <w:name w:val="Author"/>
+    <w:basedOn w:val="Title"/>
+    <w:next w:val="BodyText"/>
+    <w:qFormat/>
+    <w:pPr>
+      <w:keepNext/>
+      <w:keepLines/>
+    </w:pPr>
+    <w:rPr>
+      <w:sz w:val="24"/>
+      <w:szCs w:val="24"/>
+    </w:rPr>
+  </w:style>
+  <w:style w:type="paragraph" w:styleId="Date">
+    <w:name w:val="Date"/>
+    <w:basedOn w:val="Title"/>
+    <w:next w:val="BodyText"/>
+    <w:qFormat/>
+    <w:pPr>
+      <w:keepNext/>
+      <w:keepLines/>
+    </w:pPr>
+    <w:rPr>
+      <w:sz w:val="24"/>
+      <w:szCs w:val="24"/>
+    </w:rPr>
+  </w:style>
+  <w:style w:type="paragraph" w:customStyle="1" w:styleId="AbstractTitle">
+    <w:name w:val="Abstract Title"/>
+    <w:basedOn w:val="Normal"/>
+    <w:next w:val="Abstract"/>
+    <w:qFormat/>
+    <w:pPr>
+      <w:keepNext/>
+      <w:keepLines/>
+      <w:spacing w:before="300" w:after="0"/>
+      <w:jc w:val="center"/>
+    </w:pPr>
+    <w:rPr>
+      <w:b/>
+      <w:sz w:val="20"/>
+      <w:szCs w:val="20"/>
+    </w:rPr>
+  </w:style>
+  <w:style w:type="paragraph" w:customStyle="1" w:styleId="Abstract">
+    <w:name w:val="Abstract"/>
+    <w:basedOn w:val="Normal"/>
+    <w:next w:val="BodyText"/>
+    <w:qFormat/>
+    <w:pPr>
+      <w:keepNext/>
+      <w:keepLines/>
+      <w:spacing w:before="100" w:after="300"/>
+    </w:pPr>
+    <w:rPr>
+      <w:sz w:val="20"/>
+      <w:szCs w:val="20"/>
+    </w:rPr>
+  </w:style>
+  <w:style w:type="paragraph" w:styleId="Bibliography">
+    <w:name w:val="Bibliography"/>
+    <w:basedOn w:val="Normal"/>
+    <w:next w:val="Bibliography"/>
+    <w:qFormat/>
+    <w:pPr/>
+    <w:rPr/>
+  </w:style>
+  <w:style w:type="paragraph" w:styleId="Heading1">
     <w:name w:val="heading 1"/>
     <w:basedOn w:val="Normal"/>
     <w:next w:val="BodyText"/>
@@ -904,7 +1845,8 @@
     <w:pPr>
       <w:keepNext/>
       <w:keepLines/>
-      <w:spacing w:after="240" w:before="288" w:line="444" w:lineRule="exact"/>
+      <w:spacing w:before="288" w:after="240" w:line="444" w:lineRule="exact"/>
+      <w:ind w:firstLine="0"/>
       <w:jc w:val="center"/>
       <w:outlineLvl w:val="0"/>
     </w:pPr>
@@ -916,7 +1858,7 @@
       <w:szCs w:val="24"/>
     </w:rPr>
   </w:style>
-  <w:style w:styleId="Heading2" w:type="paragraph">
+  <w:style w:type="paragraph" w:styleId="Heading2">
     <w:name w:val="heading 2"/>
     <w:basedOn w:val="Normal"/>
     <w:next w:val="BodyText"/>
@@ -924,7 +1866,8 @@
     <w:pPr>
       <w:keepNext/>
       <w:keepLines/>
-      <w:spacing w:after="216" w:before="264" w:line="444" w:lineRule="exact"/>
+      <w:spacing w:before="264" w:after="216" w:line="444" w:lineRule="exact"/>
+      <w:ind w:firstLine="0"/>
       <w:outlineLvl w:val="1"/>
     </w:pPr>
     <w:rPr>
@@ -935,7 +1878,7 @@
       <w:szCs w:val="24"/>
     </w:rPr>
   </w:style>
-  <w:style w:styleId="Heading3" w:type="paragraph">
+  <w:style w:type="paragraph" w:styleId="Heading3">
     <w:name w:val="heading 3"/>
     <w:basedOn w:val="Normal"/>
     <w:next w:val="BodyText"/>
@@ -943,7 +1886,8 @@
     <w:pPr>
       <w:keepNext/>
       <w:keepLines/>
-      <w:spacing w:after="192" w:before="240" w:line="444" w:lineRule="exact"/>
+      <w:spacing w:before="240" w:after="192" w:line="444" w:lineRule="exact"/>
+      <w:ind w:firstLine="0"/>
       <w:outlineLvl w:val="2"/>
     </w:pPr>
     <w:rPr>
@@ -954,115 +1898,458 @@
       <w:szCs w:val="24"/>
     </w:rPr>
   </w:style>
-  <w:style w:styleId="BlockText" w:type="paragraph">
-    <w:name w:val="Block Text"/>
+  <w:style w:type="paragraph" w:styleId="Heading4">
+    <w:name w:val="heading 4"/>
     <w:basedOn w:val="Normal"/>
+    <w:next w:val="BodyText"/>
+    <w:link w:val="Heading4Char"/>
+    <w:uiPriority w:val="9"/>
+    <w:semiHidden/>
+    <w:unhideWhenUsed/>
     <w:qFormat/>
-    <w:pPr>
-      <w:spacing w:after="240" w:before="160" w:line="264" w:lineRule="exact"/>
-      <w:ind w:left="720" w:right="720"/>
-      <w:jc w:val="both"/>
-    </w:pPr>
-  </w:style>
-  <w:style w:styleId="FootnoteText" w:type="paragraph">
-    <w:name w:val="footnote text"/>
-    <w:basedOn w:val="Normal"/>
-    <w:pPr>
-      <w:spacing w:after="120" w:before="0" w:line="264" w:lineRule="exact"/>
-      <w:jc w:val="both"/>
-    </w:pPr>
-    <w:rPr>
+    <w:rsid w:val="00A10FD9"/>
+    <w:pPr>
+      <w:keepNext/>
+      <w:keepLines/>
+      <w:spacing w:before="240" w:after="120" w:line="264" w:lineRule="exact"/>
+      <w:ind w:firstLine="0"/>
+      <w:outlineLvl w:val="3"/>
+    </w:pPr>
+    <w:rPr>
+      <w:rFonts w:ascii="Times New Roman" w:hAnsi="Times New Roman" w:eastAsia="Times New Roman" w:cs="Times New Roman"/>
+      <w:b/>
+      <w:bCs/>
+      <w:i/>
+      <w:color w:val="000000"/>
       <w:sz w:val="24"/>
       <w:szCs w:val="24"/>
     </w:rPr>
   </w:style>
-  <w:style w:styleId="FootnoteReference" w:type="character">
-    <w:name w:val="footnote reference"/>
-    <w:basedOn w:val="DefaultParagraphFont"/>
-    <w:rPr>
-      <w:vertAlign w:val="superscript"/>
-    </w:rPr>
-  </w:style>
-  <w:style w:styleId="Hyperlink" w:type="character">
-    <w:name w:val="Hyperlink"/>
-    <w:basedOn w:val="DefaultParagraphFont"/>
-    <w:rPr>
-      <w:color w:val="000000"/>
-    </w:rPr>
-  </w:style>
-  <w:style w:styleId="VerbatimChar" w:type="character">
-    <w:name w:val="Verbatim Char"/>
-    <w:basedOn w:val="DefaultParagraphFont"/>
-  </w:style>
-  <w:style w:customStyle="1" w:styleId="CaptionSingle" w:type="paragraph">
-    <w:name w:val="Caption Single"/>
+  <w:style w:type="paragraph" w:styleId="Heading5">
+    <w:name w:val="heading 5"/>
     <w:basedOn w:val="Normal"/>
+    <w:next w:val="BodyText"/>
+    <w:link w:val="Heading5Char"/>
+    <w:uiPriority w:val="9"/>
+    <w:semiHidden/>
+    <w:unhideWhenUsed/>
     <w:qFormat/>
-    <w:pPr>
-      <w:spacing w:after="0" w:before="0" w:line="264" w:lineRule="exact"/>
-      <w:jc w:val="left"/>
-    </w:pPr>
-  </w:style>
-  <w:style w:customStyle="1" w:styleId="CaptionCentered" w:type="paragraph">
-    <w:name w:val="Caption Centered"/>
-    <w:basedOn w:val="CaptionSingle"/>
-    <w:qFormat/>
-    <w:pPr>
-      <w:jc w:val="center"/>
-    </w:pPr>
-  </w:style>
-  <w:style w:customStyle="1" w:styleId="CaptionRight" w:type="paragraph">
-    <w:name w:val="Caption Right"/>
-    <w:basedOn w:val="CaptionSingle"/>
-    <w:qFormat/>
-    <w:pPr>
-      <w:jc w:val="right"/>
-    </w:pPr>
-  </w:style>
-  <w:style w:customStyle="1" w:styleId="CaptionHeading" w:type="paragraph">
-    <w:name w:val="Caption Heading"/>
-    <w:basedOn w:val="CaptionCentered"/>
-    <w:qFormat/>
-    <w:rPr>
+    <w:rsid w:val="00A10FD9"/>
+    <w:pPr>
+      <w:keepNext/>
+      <w:keepLines/>
+      <w:spacing w:before="240" w:after="120" w:line="264" w:lineRule="exact"/>
+      <w:ind w:firstLine="0"/>
+      <w:outlineLvl w:val="4"/>
+    </w:pPr>
+    <w:rPr>
+      <w:rFonts w:ascii="Times New Roman" w:hAnsi="Times New Roman" w:eastAsia="Times New Roman" w:cs="Times New Roman"/>
       <w:b/>
       <w:bCs/>
-    </w:rPr>
-  </w:style>
-  <w:style w:customStyle="1" w:styleId="CaptionCase" w:type="paragraph">
-    <w:name w:val="Caption Case"/>
-    <w:basedOn w:val="CaptionSingle"/>
+      <w:i/>
+      <w:color w:val="000000"/>
+      <w:sz w:val="24"/>
+      <w:szCs w:val="24"/>
+    </w:rPr>
+  </w:style>
+  <w:style w:type="paragraph" w:styleId="Heading6">
+    <w:name w:val="heading 6"/>
+    <w:basedOn w:val="Normal"/>
+    <w:next w:val="BodyText"/>
+    <w:link w:val="Heading6Char"/>
+    <w:uiPriority w:val="9"/>
+    <w:semiHidden/>
+    <w:unhideWhenUsed/>
     <w:qFormat/>
-    <w:pPr>
-      <w:ind w:left="360"/>
-    </w:pPr>
-  </w:style>
-  <w:style w:customStyle="1" w:styleId="SignatureBlock" w:type="paragraph">
-    <w:name w:val="Signature Block"/>
-    <w:basedOn w:val="CaptionSingle"/>
+    <w:rsid w:val="00A10FD9"/>
+    <w:pPr>
+      <w:keepNext/>
+      <w:keepLines/>
+      <w:spacing w:before="40" w:after="0"/>
+      <w:outlineLvl w:val="5"/>
+    </w:pPr>
+    <w:rPr>
+      <w:rFonts w:eastAsiaTheme="majorEastAsia" w:cstheme="majorBidi"/>
+      <w:i/>
+      <w:iCs/>
+      <w:color w:val="595959" w:themeColor="text1" w:themeTint="A6"/>
+    </w:rPr>
+  </w:style>
+  <w:style w:type="paragraph" w:styleId="Heading7">
+    <w:name w:val="heading 7"/>
+    <w:basedOn w:val="Normal"/>
+    <w:next w:val="BodyText"/>
+    <w:link w:val="Heading7Char"/>
+    <w:uiPriority w:val="9"/>
+    <w:semiHidden/>
+    <w:unhideWhenUsed/>
     <w:qFormat/>
-    <w:pPr>
-      <w:ind w:left="4752"/>
-    </w:pPr>
-  </w:style>
-  <w:style w:customStyle="1" w:styleId="CertificateBody" w:type="paragraph">
-    <w:name w:val="Certificate Body"/>
+    <w:rsid w:val="00A10FD9"/>
+    <w:pPr>
+      <w:keepNext/>
+      <w:keepLines/>
+      <w:spacing w:before="40" w:after="0"/>
+      <w:outlineLvl w:val="6"/>
+    </w:pPr>
+    <w:rPr>
+      <w:rFonts w:eastAsiaTheme="majorEastAsia" w:cstheme="majorBidi"/>
+      <w:color w:val="595959" w:themeColor="text1" w:themeTint="A6"/>
+    </w:rPr>
+  </w:style>
+  <w:style w:type="paragraph" w:styleId="Heading8">
+    <w:name w:val="heading 8"/>
+    <w:basedOn w:val="Normal"/>
+    <w:next w:val="BodyText"/>
+    <w:link w:val="Heading8Char"/>
+    <w:uiPriority w:val="9"/>
+    <w:semiHidden/>
+    <w:unhideWhenUsed/>
+    <w:qFormat/>
+    <w:rsid w:val="00A10FD9"/>
+    <w:pPr>
+      <w:keepNext/>
+      <w:keepLines/>
+      <w:spacing w:after="0"/>
+      <w:outlineLvl w:val="7"/>
+    </w:pPr>
+    <w:rPr>
+      <w:rFonts w:eastAsiaTheme="majorEastAsia" w:cstheme="majorBidi"/>
+      <w:i/>
+      <w:iCs/>
+      <w:color w:val="272727" w:themeColor="text1" w:themeTint="D8"/>
+    </w:rPr>
+  </w:style>
+  <w:style w:type="paragraph" w:styleId="Heading9">
+    <w:name w:val="heading 9"/>
+    <w:basedOn w:val="Normal"/>
+    <w:next w:val="BodyText"/>
+    <w:link w:val="Heading9Char"/>
+    <w:uiPriority w:val="9"/>
+    <w:semiHidden/>
+    <w:unhideWhenUsed/>
+    <w:qFormat/>
+    <w:rsid w:val="00A10FD9"/>
+    <w:pPr>
+      <w:keepNext/>
+      <w:keepLines/>
+      <w:spacing w:after="0"/>
+      <w:outlineLvl w:val="8"/>
+    </w:pPr>
+    <w:rPr>
+      <w:rFonts w:eastAsiaTheme="majorEastAsia" w:cstheme="majorBidi"/>
+      <w:color w:val="272727" w:themeColor="text1" w:themeTint="D8"/>
+    </w:rPr>
+  </w:style>
+  <w:style w:type="character" w:customStyle="1" w:styleId="Heading1Char">
+    <w:name w:val="Heading 1 Char"/>
+    <w:basedOn w:val="DefaultParagraphFont"/>
+    <w:link w:val="Heading1"/>
+    <w:uiPriority w:val="9"/>
+    <w:rsid w:val="00A10FD9"/>
+    <w:rPr>
+      <w:rFonts w:asciiTheme="majorHAnsi" w:eastAsiaTheme="majorEastAsia" w:hAnsiTheme="majorHAnsi" w:cstheme="majorBidi"/>
+      <w:color w:val="0F4761" w:themeColor="accent1" w:themeShade="BF"/>
+      <w:sz w:val="40"/>
+      <w:szCs w:val="40"/>
+    </w:rPr>
+  </w:style>
+  <w:style w:type="character" w:customStyle="1" w:styleId="Heading2Char">
+    <w:name w:val="Heading 2 Char"/>
+    <w:basedOn w:val="DefaultParagraphFont"/>
+    <w:link w:val="Heading2"/>
+    <w:uiPriority w:val="9"/>
+    <w:semiHidden/>
+    <w:rsid w:val="00A10FD9"/>
+    <w:rPr>
+      <w:rFonts w:asciiTheme="majorHAnsi" w:eastAsiaTheme="majorEastAsia" w:hAnsiTheme="majorHAnsi" w:cstheme="majorBidi"/>
+      <w:color w:val="0F4761" w:themeColor="accent1" w:themeShade="BF"/>
+      <w:sz w:val="32"/>
+      <w:szCs w:val="32"/>
+    </w:rPr>
+  </w:style>
+  <w:style w:type="character" w:customStyle="1" w:styleId="Heading3Char">
+    <w:name w:val="Heading 3 Char"/>
+    <w:basedOn w:val="DefaultParagraphFont"/>
+    <w:link w:val="Heading3"/>
+    <w:uiPriority w:val="9"/>
+    <w:semiHidden/>
+    <w:rsid w:val="00A10FD9"/>
+    <w:rPr>
+      <w:rFonts w:eastAsiaTheme="majorEastAsia" w:cstheme="majorBidi"/>
+      <w:color w:val="0F4761" w:themeColor="accent1" w:themeShade="BF"/>
+      <w:sz w:val="28"/>
+      <w:szCs w:val="28"/>
+    </w:rPr>
+  </w:style>
+  <w:style w:type="character" w:customStyle="1" w:styleId="Heading4Char">
+    <w:name w:val="Heading 4 Char"/>
+    <w:basedOn w:val="DefaultParagraphFont"/>
+    <w:link w:val="Heading4"/>
+    <w:uiPriority w:val="9"/>
+    <w:semiHidden/>
+    <w:rsid w:val="00A10FD9"/>
+    <w:rPr>
+      <w:rFonts w:eastAsiaTheme="majorEastAsia" w:cstheme="majorBidi"/>
+      <w:i/>
+      <w:iCs/>
+      <w:color w:val="0F4761" w:themeColor="accent1" w:themeShade="BF"/>
+    </w:rPr>
+  </w:style>
+  <w:style w:type="character" w:customStyle="1" w:styleId="Heading5Char">
+    <w:name w:val="Heading 5 Char"/>
+    <w:basedOn w:val="DefaultParagraphFont"/>
+    <w:link w:val="Heading5"/>
+    <w:uiPriority w:val="9"/>
+    <w:semiHidden/>
+    <w:rsid w:val="00A10FD9"/>
+    <w:rPr>
+      <w:rFonts w:eastAsiaTheme="majorEastAsia" w:cstheme="majorBidi"/>
+      <w:color w:val="0F4761" w:themeColor="accent1" w:themeShade="BF"/>
+    </w:rPr>
+  </w:style>
+  <w:style w:type="character" w:customStyle="1" w:styleId="Heading6Char">
+    <w:name w:val="Heading 6 Char"/>
+    <w:basedOn w:val="DefaultParagraphFont"/>
+    <w:link w:val="Heading6"/>
+    <w:uiPriority w:val="9"/>
+    <w:semiHidden/>
+    <w:rsid w:val="00A10FD9"/>
+    <w:rPr>
+      <w:rFonts w:eastAsiaTheme="majorEastAsia" w:cstheme="majorBidi"/>
+      <w:i/>
+      <w:iCs/>
+      <w:color w:val="595959" w:themeColor="text1" w:themeTint="A6"/>
+    </w:rPr>
+  </w:style>
+  <w:style w:type="character" w:customStyle="1" w:styleId="Heading7Char">
+    <w:name w:val="Heading 7 Char"/>
+    <w:basedOn w:val="DefaultParagraphFont"/>
+    <w:link w:val="Heading7"/>
+    <w:uiPriority w:val="9"/>
+    <w:semiHidden/>
+    <w:rsid w:val="00A10FD9"/>
+    <w:rPr>
+      <w:rFonts w:eastAsiaTheme="majorEastAsia" w:cstheme="majorBidi"/>
+      <w:color w:val="595959" w:themeColor="text1" w:themeTint="A6"/>
+    </w:rPr>
+  </w:style>
+  <w:style w:type="character" w:customStyle="1" w:styleId="Heading8Char">
+    <w:name w:val="Heading 8 Char"/>
+    <w:basedOn w:val="DefaultParagraphFont"/>
+    <w:link w:val="Heading8"/>
+    <w:uiPriority w:val="9"/>
+    <w:semiHidden/>
+    <w:rsid w:val="00A10FD9"/>
+    <w:rPr>
+      <w:rFonts w:eastAsiaTheme="majorEastAsia" w:cstheme="majorBidi"/>
+      <w:i/>
+      <w:iCs/>
+      <w:color w:val="272727" w:themeColor="text1" w:themeTint="D8"/>
+    </w:rPr>
+  </w:style>
+  <w:style w:type="character" w:customStyle="1" w:styleId="Heading9Char">
+    <w:name w:val="Heading 9 Char"/>
+    <w:basedOn w:val="DefaultParagraphFont"/>
+    <w:link w:val="Heading9"/>
+    <w:uiPriority w:val="9"/>
+    <w:semiHidden/>
+    <w:rsid w:val="00A10FD9"/>
+    <w:rPr>
+      <w:rFonts w:eastAsiaTheme="majorEastAsia" w:cstheme="majorBidi"/>
+      <w:color w:val="272727" w:themeColor="text1" w:themeTint="D8"/>
+    </w:rPr>
+  </w:style>
+  <w:style w:type="paragraph" w:customStyle="1" w:styleId="ListItem">
+    <w:name w:val="List Item"/>
     <w:basedOn w:val="BodyText"/>
     <w:qFormat/>
     <w:pPr>
-      <w:ind w:firstLine="720"/>
-    </w:pPr>
-  </w:style>
-  <w:style w:styleId="Footer" w:type="paragraph">
-    <w:name w:val="footer"/>
+      <w:spacing w:before="0" w:after="0" w:line="444" w:lineRule="exact"/>
+      <w:ind w:left="720" w:hanging="720"/>
+    </w:pPr>
+  </w:style>
+  <w:style w:type="paragraph" w:styleId="BlockText">
+    <w:name w:val="Block Text"/>
+    <w:basedOn w:val="BodyText"/>
+    <w:next w:val="BodyText"/>
+    <w:uiPriority w:val="9"/>
+    <w:unhideWhenUsed/>
+    <w:qFormat/>
+    <w:pPr>
+      <w:spacing w:before="240" w:after="240" w:line="264" w:lineRule="exact"/>
+      <w:ind w:firstLine="0" w:left="720" w:right="720"/>
+    </w:pPr>
+  </w:style>
+  <w:style w:type="paragraph" w:styleId="FootnoteText">
+    <w:name w:val="Footnote Text"/>
     <w:basedOn w:val="Normal"/>
-    <w:pPr>
-      <w:spacing w:after="0" w:before="0" w:line="240" w:lineRule="auto"/>
-      <w:jc w:val="center"/>
+    <w:next w:val="FootnoteText"/>
+    <w:uiPriority w:val="9"/>
+    <w:unhideWhenUsed/>
+    <w:qFormat/>
+    <w:pPr>
+      <w:keepLines/>
+      <w:spacing w:before="0" w:after="120" w:line="264" w:lineRule="exact"/>
     </w:pPr>
     <w:rPr>
       <w:sz w:val="24"/>
       <w:szCs w:val="24"/>
     </w:rPr>
+  </w:style>
+  <w:style w:type="paragraph" w:styleId="FootnoteBlockText">
+    <w:name w:val="Footnote Block Text"/>
+    <w:basedOn w:val="FootnoteText"/>
+    <w:next w:val="FootnoteText"/>
+    <w:uiPriority w:val="9"/>
+    <w:unhideWhenUsed/>
+    <w:qFormat/>
+    <w:pPr>
+      <w:spacing w:before="240" w:after="240"/>
+      <w:ind w:firstLine="0" w:left="720" w:right="720"/>
+    </w:pPr>
+  </w:style>
+  <w:style w:type="character" w:default="1" w:styleId="DefaultParagraphFont">
+    <w:name w:val="Default Paragraph Font"/>
+    <w:semiHidden/>
+    <w:unhideWhenUsed/>
+  </w:style>
+  <w:style w:type="table" w:default="1" w:styleId="Table">
+    <w:name w:val="Table"/>
+    <w:basedOn w:val="TableNormal"/>
+    <w:qFormat/>
+    <w:tblPr>
+      <w:tblInd w:w="0" w:type="dxa"/>
+      <w:tblCellMar>
+        <w:top w:w="0" w:type="dxa"/>
+        <w:left w:w="108" w:type="dxa"/>
+        <w:bottom w:w="0" w:type="dxa"/>
+        <w:right w:w="108" w:type="dxa"/>
+      </w:tblCellMar>
+    </w:tblPr>
+    <w:tblStylePr w:type="firstRow">
+      <w:tcPr>
+        <w:tcBorders>
+          <w:bottom w:val="single"/>
+        </w:tcBorders>
+        <w:vAlign w:val="bottom"/>
+      </w:tcPr>
+    </w:tblStylePr>
+  </w:style>
+  <w:style w:type="paragraph" w:customStyle="1" w:styleId="DefinitionTerm">
+    <w:name w:val="Definition Term"/>
+    <w:basedOn w:val="Normal"/>
+    <w:next w:val="Definition"/>
+    <w:pPr>
+      <w:keepNext/>
+      <w:keepLines/>
+      <w:spacing w:after="0"/>
+    </w:pPr>
+    <w:rPr>
+      <w:b/>
+    </w:rPr>
+  </w:style>
+  <w:style w:type="paragraph" w:customStyle="1" w:styleId="Definition">
+    <w:name w:val="Definition"/>
+    <w:basedOn w:val="Normal"/>
+  </w:style>
+  <w:style w:type="paragraph" w:styleId="Caption">
+    <w:name w:val="Caption"/>
+    <w:basedOn w:val="Normal"/>
+    <w:link w:val="BodyTextChar"/>
+    <w:pPr>
+      <w:spacing w:before="0" w:after="120"/>
+    </w:pPr>
+    <w:rPr>
+      <w:i/>
+    </w:rPr>
+  </w:style>
+  <w:style w:type="paragraph" w:customStyle="1" w:styleId="TableCaption">
+    <w:name w:val="Table Caption"/>
+    <w:basedOn w:val="Caption"/>
+    <w:pPr>
+      <w:keepNext/>
+    </w:pPr>
+  </w:style>
+  <w:style w:type="paragraph" w:customStyle="1" w:styleId="ImageCaption">
+    <w:name w:val="Image Caption"/>
+    <w:basedOn w:val="Caption"/>
+  </w:style>
+  <w:style w:type="paragraph" w:customStyle="1" w:styleId="Figure">
+    <w:name w:val="Figure"/>
+    <w:basedOn w:val="Normal"/>
+  </w:style>
+  <w:style w:type="paragraph" w:customStyle="1" w:styleId="CaptionedFigure">
+    <w:name w:val="Captioned Figure"/>
+    <w:basedOn w:val="Figure"/>
+    <w:pPr>
+      <w:keepNext/>
+    </w:pPr>
+  </w:style>
+  <w:style w:type="character" w:customStyle="1" w:styleId="BodyTextChar">
+    <w:name w:val="Body Text Char"/>
+    <w:basedOn w:val="DefaultParagraphFont"/>
+    <w:link w:val="BodyText"/>
+  </w:style>
+  <w:style w:type="character" w:customStyle="1" w:styleId="VerbatimChar">
+    <w:name w:val="Verbatim Char"/>
+    <w:basedOn w:val="BodyTextChar"/>
+    <w:rPr>
+      <w:rFonts w:ascii="Consolas" w:hAnsi="Consolas"/>
+      <w:sz w:val="22"/>
+    </w:rPr>
+  </w:style>
+  <w:style w:type="character" w:customStyle="1" w:styleId="SectionNumber">
+    <w:name w:val="Section Number"/>
+    <w:basedOn w:val="BodyTextChar"/>
+  </w:style>
+  <w:style w:type="character" w:styleId="FootnoteReference">
+    <w:name w:val="Footnote Reference"/>
+    <w:basedOn w:val="BodyTextChar"/>
+    <w:rPr>
+      <w:vertAlign w:val="superscript"/>
+    </w:rPr>
+  </w:style>
+  <w:style w:type="character" w:styleId="Hyperlink">
+    <w:name w:val="Hyperlink"/>
+    <w:basedOn w:val="BodyTextChar"/>
+    <w:rPr>
+      <w:color w:val="000000"/>
+    </w:rPr>
+  </w:style>
+  <w:style w:type="paragraph" w:styleId="TOCHeading">
+    <w:name w:val="TOC Heading"/>
+    <w:basedOn w:val="Heading1"/>
+    <w:next w:val="BodyText"/>
+    <w:uiPriority w:val="39"/>
+    <w:unhideWhenUsed/>
+    <w:qFormat/>
+    <w:pPr>
+      <w:spacing w:before="240" w:line="259" w:lineRule="auto"/>
+      <w:outlineLvl w:val="9"/>
+    </w:pPr>
+    <w:rPr>
+      <w:rFonts w:asciiTheme="majorHAnsi" w:eastAsiaTheme="majorEastAsia" w:hAnsiTheme="majorHAnsi" w:cstheme="majorBidi"/>
+      <w:b w:val="0"/>
+      <w:bCs w:val="0"/>
+      <w:color w:val="365F91" w:themeColor="accent1" w:themeShade="BF"/>
+    </w:rPr>
+  </w:style>
+  <w:style w:type="paragraph" w:customStyle="1" w:styleId="NumberedParagraph">
+    <w:name w:val="Numbered Paragraph"/>
+    <w:basedOn w:val="BodyText"/>
+    <w:qFormat/>
+    <w:pPr>
+      <w:spacing w:before="0" w:after="144" w:line="444" w:lineRule="exact"/>
+      <w:ind w:firstLine="720"/>
+    </w:pPr>
+  </w:style>
+  <w:style w:type="paragraph" w:customStyle="1" w:styleId="BodyTextNote">
+    <w:name w:val="Body Text Note"/>
+    <w:basedOn w:val="BodyText"/>
+    <w:qFormat/>
+    <w:pPr>
+      <w:widowControl w:val="0"/>
+    </w:pPr>
   </w:style>
   <w:style w:type="paragraph" w:customStyle="1" w:styleId="SourceCode">
     <w:name w:val="Source Code"/>

</xml_diff>